<commit_message>
docs(operator-manual): regenerate the PDF and Word
</commit_message>
<xml_diff>
--- a/09_MANUALES/EN/WORD/09_Operator_User_Manual.docx
+++ b/09_MANUALES/EN/WORD/09_Operator_User_Manual.docx
@@ -64,15 +64,15 @@
         <w:pStyle w:val="BodyText"/>
       </w:pPr>
       <w:r>
-        <w:t xml:space="preserve">October 26, 2026</w:t>
-      </w:r>
-    </w:p>
-    <w:p>
-      <w:pPr>
-        <w:pStyle w:val="BodyText"/>
-      </w:pPr>
-      <w:r>
-        <w:t xml:space="preserve">Manual Type: User Manual for the Operator Role (web application and Android mobile application) · Version 1.2</w:t>
+        <w:t xml:space="preserve">October 27, 2026</w:t>
+      </w:r>
+    </w:p>
+    <w:p>
+      <w:pPr>
+        <w:pStyle w:val="BodyText"/>
+      </w:pPr>
+      <w:r>
+        <w:t xml:space="preserve">Manual Type: User Manual for the Operator Role (web application and Android mobile application) · Version 1.3</w:t>
       </w:r>
     </w:p>
     <w:bookmarkStart w:id="9" w:name="version-control"/>
@@ -348,6 +348,65 @@
             </w:pPr>
             <w:r>
               <w:t xml:space="preserve">Mobile application screenshots (Figures 15 to 18) in section 10.9; logging out becomes Figure 19.</w:t>
+            </w:r>
+          </w:p>
+        </w:tc>
+        <w:tc>
+          <w:tcPr/>
+          <w:p>
+            <w:pPr>
+              <w:pStyle w:val="Compact"/>
+            </w:pPr>
+            <w:r>
+              <w:t xml:space="preserve">Development team</w:t>
+            </w:r>
+          </w:p>
+        </w:tc>
+      </w:tr>
+      <w:tr>
+        <w:tc>
+          <w:tcPr/>
+          <w:p>
+            <w:pPr>
+              <w:pStyle w:val="Compact"/>
+            </w:pPr>
+            <w:r>
+              <w:t xml:space="preserve">1.3</w:t>
+            </w:r>
+          </w:p>
+        </w:tc>
+        <w:tc>
+          <w:tcPr/>
+          <w:p>
+            <w:pPr>
+              <w:pStyle w:val="Compact"/>
+            </w:pPr>
+            <w:r>
+              <w:t xml:space="preserve">2026-10-27</w:t>
+            </w:r>
+          </w:p>
+        </w:tc>
+        <w:tc>
+          <w:tcPr/>
+          <w:p>
+            <w:pPr>
+              <w:pStyle w:val="Compact"/>
+            </w:pPr>
+            <w:r>
+              <w:t xml:space="preserve">Reference of the mobile application with repository version</w:t>
+            </w:r>
+            <w:r>
+              <w:t xml:space="preserve"> </w:t>
+            </w:r>
+            <w:r>
+              <w:rPr>
+                <w:i/>
+                <w:iCs/>
+              </w:rPr>
+              <w:t xml:space="preserve">v1.1.2</w:t>
+            </w:r>
+            <w:r>
+              <w:t xml:space="preserve">, of October 27, 2026 (References).</w:t>
             </w:r>
           </w:p>
         </w:tc>
@@ -10451,7 +10510,7 @@
         <w:t xml:space="preserve"> </w:t>
       </w:r>
       <w:r>
-        <w:t xml:space="preserve">(version 1.1.0) [Computer software]. GitHub.</w:t>
+        <w:t xml:space="preserve">(version 1.1.2) [Computer software]. GitHub.</w:t>
       </w:r>
       <w:r>
         <w:t xml:space="preserve"> </w:t>

</xml_diff>